<commit_message>
Updated GDV4000 Marking Sheet. All marking done, IV3a shared with Glenn.
</commit_message>
<xml_diff>
--- a/T2/GDV4000/Marking/Olympia/WRIT1_Allcock_20300963.docx
+++ b/T2/GDV4000/Marking/Olympia/WRIT1_Allcock_20300963.docx
@@ -98,7 +98,16 @@
                 <w:color w:val="000000" w:themeColor="text1"/>
                 <w:spacing w:val="-4"/>
               </w:rPr>
-              <w:t>40</w:t>
+              <w:t>4</w:t>
+            </w:r>
+            <w:r>
+              <w:rPr>
+                <w:rFonts w:asciiTheme="minorHAnsi" w:hAnsiTheme="minorHAnsi" w:cstheme="minorHAnsi"/>
+                <w:b/>
+                <w:color w:val="000000" w:themeColor="text1"/>
+                <w:spacing w:val="-4"/>
+              </w:rPr>
+              <w:t>3</w:t>
             </w:r>
             <w:r>
               <w:rPr>
@@ -222,16 +231,7 @@
                 <w:color w:val="000000" w:themeColor="text1"/>
                 <w:spacing w:val="-5"/>
               </w:rPr>
-              <w:t>4</w:t>
-            </w:r>
-            <w:r>
-              <w:rPr>
-                <w:rFonts w:asciiTheme="minorHAnsi" w:hAnsiTheme="minorHAnsi" w:cstheme="minorHAnsi"/>
-                <w:b/>
-                <w:color w:val="000000" w:themeColor="text1"/>
-                <w:spacing w:val="-5"/>
-              </w:rPr>
-              <w:t>0</w:t>
+              <w:t>31</w:t>
             </w:r>
           </w:p>
         </w:tc>
@@ -1198,7 +1198,7 @@
                 <w:b/>
                 <w:spacing w:val="-5"/>
               </w:rPr>
-              <w:t>9</w:t>
+              <w:t>12</w:t>
             </w:r>
           </w:p>
         </w:tc>
@@ -1581,7 +1581,7 @@
                 <w:rFonts w:asciiTheme="minorHAnsi" w:hAnsiTheme="minorHAnsi" w:cstheme="minorHAnsi"/>
                 <w:spacing w:val="-5"/>
               </w:rPr>
-              <w:t>0</w:t>
+              <w:t>3</w:t>
             </w:r>
           </w:p>
         </w:tc>
@@ -2592,13 +2592,7 @@
           <w:p/>
           <w:p>
             <w:r>
-              <w:t xml:space="preserve"> </w:t>
-            </w:r>
-            <w:r>
-              <w:t>Overall, this is a very good piece of work. It is unevenly balanced in the level of research and detail in some sections</w:t>
-            </w:r>
-            <w:r>
-              <w:t>, but there are also aspects of it that go beyond what was expected. Certainly, for a first attempt at a GDD at L4, you have done exceedingly well.</w:t>
+              <w:t xml:space="preserve"> Overall, this is a very good piece of work. It is unevenly balanced in the level of research and detail in some sections, but there are also aspects of it that go beyond what was expected. Certainly, for a first attempt at a GDD at L4, you have done exceedingly well.</w:t>
             </w:r>
           </w:p>
           <w:p/>
@@ -3286,6 +3280,7 @@
   <w:style w:type="character" w:default="1" w:styleId="DefaultParagraphFont">
     <w:name w:val="Default Paragraph Font"/>
     <w:uiPriority w:val="1"/>
+    <w:semiHidden/>
     <w:unhideWhenUsed/>
   </w:style>
   <w:style w:type="table" w:default="1" w:styleId="TableNormal">

</xml_diff>